<commit_message>
﻿Update: User Guide - commands in copy-pastable code boxes
</commit_message>
<xml_diff>
--- a/docs/F5-to-Alteon_User_Guide.docx
+++ b/docs/F5-to-Alteon_User_Guide.docx
@@ -347,7 +347,7 @@
       <w:r>
         <w:fldChar w:fldCharType="separate"/>
       </w:r>
-      <w:hyperlink w:anchor="_Toc235645527" w:history="1">
+      <w:hyperlink w:anchor="_Toc235645920" w:history="1">
         <w:r>
           <w:rPr>
             <w:rStyle w:val="Hyperlink"/>
@@ -374,7 +374,7 @@
             <w:noProof/>
             <w:webHidden/>
           </w:rPr>
-          <w:instrText xml:space="preserve"> PAGEREF _Toc235645527 \h </w:instrText>
+          <w:instrText xml:space="preserve"> PAGEREF _Toc235645920 \h </w:instrText>
         </w:r>
         <w:r>
           <w:rPr>
@@ -418,7 +418,7 @@
           <w14:ligatures w14:val="standardContextual"/>
         </w:rPr>
       </w:pPr>
-      <w:hyperlink w:anchor="_Toc235645528" w:history="1">
+      <w:hyperlink w:anchor="_Toc235645921" w:history="1">
         <w:r>
           <w:rPr>
             <w:rStyle w:val="Hyperlink"/>
@@ -445,7 +445,7 @@
             <w:noProof/>
             <w:webHidden/>
           </w:rPr>
-          <w:instrText xml:space="preserve"> PAGEREF _Toc235645528 \h </w:instrText>
+          <w:instrText xml:space="preserve"> PAGEREF _Toc235645921 \h </w:instrText>
         </w:r>
         <w:r>
           <w:rPr>
@@ -489,7 +489,7 @@
           <w14:ligatures w14:val="standardContextual"/>
         </w:rPr>
       </w:pPr>
-      <w:hyperlink w:anchor="_Toc235645529" w:history="1">
+      <w:hyperlink w:anchor="_Toc235645922" w:history="1">
         <w:r>
           <w:rPr>
             <w:rStyle w:val="Hyperlink"/>
@@ -516,7 +516,7 @@
             <w:noProof/>
             <w:webHidden/>
           </w:rPr>
-          <w:instrText xml:space="preserve"> PAGEREF _Toc235645529 \h </w:instrText>
+          <w:instrText xml:space="preserve"> PAGEREF _Toc235645922 \h </w:instrText>
         </w:r>
         <w:r>
           <w:rPr>
@@ -560,7 +560,7 @@
           <w14:ligatures w14:val="standardContextual"/>
         </w:rPr>
       </w:pPr>
-      <w:hyperlink w:anchor="_Toc235645530" w:history="1">
+      <w:hyperlink w:anchor="_Toc235645923" w:history="1">
         <w:r>
           <w:rPr>
             <w:rStyle w:val="Hyperlink"/>
@@ -587,7 +587,7 @@
             <w:noProof/>
             <w:webHidden/>
           </w:rPr>
-          <w:instrText xml:space="preserve"> PAGEREF _Toc235645530 \h </w:instrText>
+          <w:instrText xml:space="preserve"> PAGEREF _Toc235645923 \h </w:instrText>
         </w:r>
         <w:r>
           <w:rPr>
@@ -631,7 +631,7 @@
           <w14:ligatures w14:val="standardContextual"/>
         </w:rPr>
       </w:pPr>
-      <w:hyperlink w:anchor="_Toc235645531" w:history="1">
+      <w:hyperlink w:anchor="_Toc235645924" w:history="1">
         <w:r>
           <w:rPr>
             <w:rStyle w:val="Hyperlink"/>
@@ -658,7 +658,7 @@
             <w:noProof/>
             <w:webHidden/>
           </w:rPr>
-          <w:instrText xml:space="preserve"> PAGEREF _Toc235645531 \h </w:instrText>
+          <w:instrText xml:space="preserve"> PAGEREF _Toc235645924 \h </w:instrText>
         </w:r>
         <w:r>
           <w:rPr>
@@ -702,7 +702,7 @@
           <w14:ligatures w14:val="standardContextual"/>
         </w:rPr>
       </w:pPr>
-      <w:hyperlink w:anchor="_Toc235645532" w:history="1">
+      <w:hyperlink w:anchor="_Toc235645925" w:history="1">
         <w:r>
           <w:rPr>
             <w:rStyle w:val="Hyperlink"/>
@@ -729,7 +729,7 @@
             <w:noProof/>
             <w:webHidden/>
           </w:rPr>
-          <w:instrText xml:space="preserve"> PAGEREF _Toc235645532 \h </w:instrText>
+          <w:instrText xml:space="preserve"> PAGEREF _Toc235645925 \h </w:instrText>
         </w:r>
         <w:r>
           <w:rPr>
@@ -749,7 +749,7 @@
             <w:noProof/>
             <w:webHidden/>
           </w:rPr>
-          <w:t>3</w:t>
+          <w:t>4</w:t>
         </w:r>
         <w:r>
           <w:rPr>
@@ -773,7 +773,7 @@
           <w14:ligatures w14:val="standardContextual"/>
         </w:rPr>
       </w:pPr>
-      <w:hyperlink w:anchor="_Toc235645533" w:history="1">
+      <w:hyperlink w:anchor="_Toc235645926" w:history="1">
         <w:r>
           <w:rPr>
             <w:rStyle w:val="Hyperlink"/>
@@ -800,7 +800,7 @@
             <w:noProof/>
             <w:webHidden/>
           </w:rPr>
-          <w:instrText xml:space="preserve"> PAGEREF _Toc235645533 \h </w:instrText>
+          <w:instrText xml:space="preserve"> PAGEREF _Toc235645926 \h </w:instrText>
         </w:r>
         <w:r>
           <w:rPr>
@@ -844,7 +844,7 @@
           <w14:ligatures w14:val="standardContextual"/>
         </w:rPr>
       </w:pPr>
-      <w:hyperlink w:anchor="_Toc235645534" w:history="1">
+      <w:hyperlink w:anchor="_Toc235645927" w:history="1">
         <w:r>
           <w:rPr>
             <w:rStyle w:val="Hyperlink"/>
@@ -871,7 +871,7 @@
             <w:noProof/>
             <w:webHidden/>
           </w:rPr>
-          <w:instrText xml:space="preserve"> PAGEREF _Toc235645534 \h </w:instrText>
+          <w:instrText xml:space="preserve"> PAGEREF _Toc235645927 \h </w:instrText>
         </w:r>
         <w:r>
           <w:rPr>
@@ -915,7 +915,7 @@
           <w14:ligatures w14:val="standardContextual"/>
         </w:rPr>
       </w:pPr>
-      <w:hyperlink w:anchor="_Toc235645535" w:history="1">
+      <w:hyperlink w:anchor="_Toc235645928" w:history="1">
         <w:r>
           <w:rPr>
             <w:rStyle w:val="Hyperlink"/>
@@ -942,7 +942,7 @@
             <w:noProof/>
             <w:webHidden/>
           </w:rPr>
-          <w:instrText xml:space="preserve"> PAGEREF _Toc235645535 \h </w:instrText>
+          <w:instrText xml:space="preserve"> PAGEREF _Toc235645928 \h </w:instrText>
         </w:r>
         <w:r>
           <w:rPr>
@@ -986,7 +986,7 @@
           <w14:ligatures w14:val="standardContextual"/>
         </w:rPr>
       </w:pPr>
-      <w:hyperlink w:anchor="_Toc235645536" w:history="1">
+      <w:hyperlink w:anchor="_Toc235645929" w:history="1">
         <w:r>
           <w:rPr>
             <w:rStyle w:val="Hyperlink"/>
@@ -1013,7 +1013,7 @@
             <w:noProof/>
             <w:webHidden/>
           </w:rPr>
-          <w:instrText xml:space="preserve"> PAGEREF _Toc235645536 \h </w:instrText>
+          <w:instrText xml:space="preserve"> PAGEREF _Toc235645929 \h </w:instrText>
         </w:r>
         <w:r>
           <w:rPr>
@@ -1033,7 +1033,7 @@
             <w:noProof/>
             <w:webHidden/>
           </w:rPr>
-          <w:t>4</w:t>
+          <w:t>5</w:t>
         </w:r>
         <w:r>
           <w:rPr>
@@ -1057,7 +1057,7 @@
           <w14:ligatures w14:val="standardContextual"/>
         </w:rPr>
       </w:pPr>
-      <w:hyperlink w:anchor="_Toc235645537" w:history="1">
+      <w:hyperlink w:anchor="_Toc235645930" w:history="1">
         <w:r>
           <w:rPr>
             <w:rStyle w:val="Hyperlink"/>
@@ -1084,7 +1084,7 @@
             <w:noProof/>
             <w:webHidden/>
           </w:rPr>
-          <w:instrText xml:space="preserve"> PAGEREF _Toc235645537 \h </w:instrText>
+          <w:instrText xml:space="preserve"> PAGEREF _Toc235645930 \h </w:instrText>
         </w:r>
         <w:r>
           <w:rPr>
@@ -1128,7 +1128,7 @@
           <w14:ligatures w14:val="standardContextual"/>
         </w:rPr>
       </w:pPr>
-      <w:hyperlink w:anchor="_Toc235645538" w:history="1">
+      <w:hyperlink w:anchor="_Toc235645931" w:history="1">
         <w:r>
           <w:rPr>
             <w:rStyle w:val="Hyperlink"/>
@@ -1155,7 +1155,7 @@
             <w:noProof/>
             <w:webHidden/>
           </w:rPr>
-          <w:instrText xml:space="preserve"> PAGEREF _Toc235645538 \h </w:instrText>
+          <w:instrText xml:space="preserve"> PAGEREF _Toc235645931 \h </w:instrText>
         </w:r>
         <w:r>
           <w:rPr>
@@ -1199,7 +1199,7 @@
           <w14:ligatures w14:val="standardContextual"/>
         </w:rPr>
       </w:pPr>
-      <w:hyperlink w:anchor="_Toc235645539" w:history="1">
+      <w:hyperlink w:anchor="_Toc235645932" w:history="1">
         <w:r>
           <w:rPr>
             <w:rStyle w:val="Hyperlink"/>
@@ -1226,7 +1226,7 @@
             <w:noProof/>
             <w:webHidden/>
           </w:rPr>
-          <w:instrText xml:space="preserve"> PAGEREF _Toc235645539 \h </w:instrText>
+          <w:instrText xml:space="preserve"> PAGEREF _Toc235645932 \h </w:instrText>
         </w:r>
         <w:r>
           <w:rPr>
@@ -1270,7 +1270,7 @@
           <w14:ligatures w14:val="standardContextual"/>
         </w:rPr>
       </w:pPr>
-      <w:hyperlink w:anchor="_Toc235645540" w:history="1">
+      <w:hyperlink w:anchor="_Toc235645933" w:history="1">
         <w:r>
           <w:rPr>
             <w:rStyle w:val="Hyperlink"/>
@@ -1297,7 +1297,7 @@
             <w:noProof/>
             <w:webHidden/>
           </w:rPr>
-          <w:instrText xml:space="preserve"> PAGEREF _Toc235645540 \h </w:instrText>
+          <w:instrText xml:space="preserve"> PAGEREF _Toc235645933 \h </w:instrText>
         </w:r>
         <w:r>
           <w:rPr>
@@ -1341,7 +1341,7 @@
           <w14:ligatures w14:val="standardContextual"/>
         </w:rPr>
       </w:pPr>
-      <w:hyperlink w:anchor="_Toc235645541" w:history="1">
+      <w:hyperlink w:anchor="_Toc235645934" w:history="1">
         <w:r>
           <w:rPr>
             <w:rStyle w:val="Hyperlink"/>
@@ -1368,7 +1368,7 @@
             <w:noProof/>
             <w:webHidden/>
           </w:rPr>
-          <w:instrText xml:space="preserve"> PAGEREF _Toc235645541 \h </w:instrText>
+          <w:instrText xml:space="preserve"> PAGEREF _Toc235645934 \h </w:instrText>
         </w:r>
         <w:r>
           <w:rPr>
@@ -1412,7 +1412,7 @@
           <w14:ligatures w14:val="standardContextual"/>
         </w:rPr>
       </w:pPr>
-      <w:hyperlink w:anchor="_Toc235645542" w:history="1">
+      <w:hyperlink w:anchor="_Toc235645935" w:history="1">
         <w:r>
           <w:rPr>
             <w:rStyle w:val="Hyperlink"/>
@@ -1439,7 +1439,7 @@
             <w:noProof/>
             <w:webHidden/>
           </w:rPr>
-          <w:instrText xml:space="preserve"> PAGEREF _Toc235645542 \h </w:instrText>
+          <w:instrText xml:space="preserve"> PAGEREF _Toc235645935 \h </w:instrText>
         </w:r>
         <w:r>
           <w:rPr>
@@ -1483,7 +1483,7 @@
           <w14:ligatures w14:val="standardContextual"/>
         </w:rPr>
       </w:pPr>
-      <w:hyperlink w:anchor="_Toc235645543" w:history="1">
+      <w:hyperlink w:anchor="_Toc235645936" w:history="1">
         <w:r>
           <w:rPr>
             <w:rStyle w:val="Hyperlink"/>
@@ -1510,7 +1510,7 @@
             <w:noProof/>
             <w:webHidden/>
           </w:rPr>
-          <w:instrText xml:space="preserve"> PAGEREF _Toc235645543 \h </w:instrText>
+          <w:instrText xml:space="preserve"> PAGEREF _Toc235645936 \h </w:instrText>
         </w:r>
         <w:r>
           <w:rPr>
@@ -1554,7 +1554,7 @@
           <w14:ligatures w14:val="standardContextual"/>
         </w:rPr>
       </w:pPr>
-      <w:hyperlink w:anchor="_Toc235645544" w:history="1">
+      <w:hyperlink w:anchor="_Toc235645937" w:history="1">
         <w:r>
           <w:rPr>
             <w:rStyle w:val="Hyperlink"/>
@@ -1581,7 +1581,7 @@
             <w:noProof/>
             <w:webHidden/>
           </w:rPr>
-          <w:instrText xml:space="preserve"> PAGEREF _Toc235645544 \h </w:instrText>
+          <w:instrText xml:space="preserve"> PAGEREF _Toc235645937 \h </w:instrText>
         </w:r>
         <w:r>
           <w:rPr>
@@ -1626,7 +1626,7 @@
       <w:pPr>
         <w:pStyle w:val="Heading1"/>
       </w:pPr>
-      <w:bookmarkStart w:id="0" w:name="_Toc235645527"/>
+      <w:bookmarkStart w:id="0" w:name="_Toc235645920"/>
       <w:r>
         <w:lastRenderedPageBreak/>
         <w:t>Overview</w:t>
@@ -1647,7 +1647,7 @@
       <w:pPr>
         <w:pStyle w:val="Heading1"/>
       </w:pPr>
-      <w:bookmarkStart w:id="1" w:name="_Toc235645528"/>
+      <w:bookmarkStart w:id="1" w:name="_Toc235645921"/>
       <w:r>
         <w:t>Requirements</w:t>
       </w:r>
@@ -1655,14 +1655,79 @@
     </w:p>
     <w:p>
       <w:r>
-        <w:t>The only requirement is Node.js 16 or newer, on Windows, macOS, or Linux. There are no other dependencies. Verify with node --version. If Node.js is missing, install it from nodejs.org (Windows: winget install OpenJS.NodeJS.LTS; macOS: brew install node; Debian/Ubuntu: sudo apt install nodejs npm).</w:t>
+        <w:t>The only requirement is Node.js 16 or newer, on Windows, macOS, or Linux. There are no other dependencies. Verify with:</w:t>
       </w:r>
     </w:p>
     <w:p>
       <w:pPr>
+        <w:shd w:val="clear" w:color="auto" w:fill="F1F3F5"/>
+        <w:spacing w:before="60" w:after="140"/>
+        <w:ind w:left="144"/>
+      </w:pPr>
+      <w:r>
+        <w:rPr>
+          <w:rFonts w:ascii="Courier New" w:eastAsia="Courier New" w:hAnsi="Courier New"/>
+          <w:color w:val="1E1E1E"/>
+          <w:sz w:val="16"/>
+        </w:rPr>
+        <w:t>node --version</w:t>
+      </w:r>
+    </w:p>
+    <w:p>
+      <w:r>
+        <w:t>If Node.js is missing, install it from nodejs.org or with your package manager:</w:t>
+      </w:r>
+    </w:p>
+    <w:p>
+      <w:pPr>
+        <w:shd w:val="clear" w:color="auto" w:fill="F1F3F5"/>
+        <w:spacing w:before="60" w:after="0"/>
+        <w:ind w:left="144"/>
+      </w:pPr>
+      <w:r>
+        <w:rPr>
+          <w:rFonts w:ascii="Courier New" w:eastAsia="Courier New" w:hAnsi="Courier New"/>
+          <w:color w:val="1E1E1E"/>
+          <w:sz w:val="16"/>
+        </w:rPr>
+        <w:t>winget install OpenJS.NodeJS.LTS        # Windows</w:t>
+      </w:r>
+    </w:p>
+    <w:p>
+      <w:pPr>
+        <w:shd w:val="clear" w:color="auto" w:fill="F1F3F5"/>
+        <w:spacing w:after="0"/>
+        <w:ind w:left="144"/>
+      </w:pPr>
+      <w:r>
+        <w:rPr>
+          <w:rFonts w:ascii="Courier New" w:eastAsia="Courier New" w:hAnsi="Courier New"/>
+          <w:color w:val="1E1E1E"/>
+          <w:sz w:val="16"/>
+        </w:rPr>
+        <w:t>brew install node                       # macOS</w:t>
+      </w:r>
+    </w:p>
+    <w:p>
+      <w:pPr>
+        <w:shd w:val="clear" w:color="auto" w:fill="F1F3F5"/>
+        <w:spacing w:after="140"/>
+        <w:ind w:left="144"/>
+      </w:pPr>
+      <w:r>
+        <w:rPr>
+          <w:rFonts w:ascii="Courier New" w:eastAsia="Courier New" w:hAnsi="Courier New"/>
+          <w:color w:val="1E1E1E"/>
+          <w:sz w:val="16"/>
+        </w:rPr>
+        <w:t>sudo apt install nodejs npm             # Linux (Debian/Ubuntu)</w:t>
+      </w:r>
+    </w:p>
+    <w:p>
+      <w:pPr>
         <w:pStyle w:val="Heading1"/>
       </w:pPr>
-      <w:bookmarkStart w:id="2" w:name="_Toc235645529"/>
+      <w:bookmarkStart w:id="2" w:name="_Toc235645922"/>
       <w:r>
         <w:t>Installation</w:t>
       </w:r>
@@ -1677,17 +1742,23 @@
       <w:pPr>
         <w:pStyle w:val="Heading2"/>
       </w:pPr>
-      <w:bookmarkStart w:id="3" w:name="_Toc235645530"/>
+      <w:bookmarkStart w:id="3" w:name="_Toc235645923"/>
       <w:r>
         <w:t>Run instantly with npx (recommended)</w:t>
       </w:r>
       <w:bookmarkEnd w:id="3"/>
     </w:p>
     <w:p>
+      <w:pPr>
+        <w:shd w:val="clear" w:color="auto" w:fill="F1F3F5"/>
+        <w:spacing w:before="60" w:after="140"/>
+        <w:ind w:left="144"/>
+      </w:pPr>
       <w:r>
         <w:rPr>
-          <w:rFonts w:ascii="Consolas" w:hAnsi="Consolas"/>
-          <w:sz w:val="19"/>
+          <w:rFonts w:ascii="Courier New" w:eastAsia="Courier New" w:hAnsi="Courier New"/>
+          <w:color w:val="1E1E1E"/>
+          <w:sz w:val="16"/>
         </w:rPr>
         <w:t>npx @radware/f5-to-alteon device.qkview -o out/</w:t>
       </w:r>
@@ -1696,26 +1767,38 @@
       <w:pPr>
         <w:pStyle w:val="Heading2"/>
       </w:pPr>
-      <w:bookmarkStart w:id="4" w:name="_Toc235645531"/>
+      <w:bookmarkStart w:id="4" w:name="_Toc235645924"/>
       <w:r>
         <w:t>Or install globally</w:t>
       </w:r>
       <w:bookmarkEnd w:id="4"/>
     </w:p>
     <w:p>
+      <w:pPr>
+        <w:shd w:val="clear" w:color="auto" w:fill="F1F3F5"/>
+        <w:spacing w:before="60" w:after="0"/>
+        <w:ind w:left="144"/>
+      </w:pPr>
       <w:r>
         <w:rPr>
-          <w:rFonts w:ascii="Consolas" w:hAnsi="Consolas"/>
-          <w:sz w:val="19"/>
+          <w:rFonts w:ascii="Courier New" w:eastAsia="Courier New" w:hAnsi="Courier New"/>
+          <w:color w:val="1E1E1E"/>
+          <w:sz w:val="16"/>
         </w:rPr>
         <w:t>npm install -g @radware/f5-to-alteon</w:t>
       </w:r>
     </w:p>
     <w:p>
+      <w:pPr>
+        <w:shd w:val="clear" w:color="auto" w:fill="F1F3F5"/>
+        <w:spacing w:after="140"/>
+        <w:ind w:left="144"/>
+      </w:pPr>
       <w:r>
         <w:rPr>
-          <w:rFonts w:ascii="Consolas" w:hAnsi="Consolas"/>
-          <w:sz w:val="19"/>
+          <w:rFonts w:ascii="Courier New" w:eastAsia="Courier New" w:hAnsi="Courier New"/>
+          <w:color w:val="1E1E1E"/>
+          <w:sz w:val="16"/>
         </w:rPr>
         <w:t>f5-to-alteon device.qkview -o out/</w:t>
       </w:r>
@@ -1724,35 +1807,53 @@
       <w:pPr>
         <w:pStyle w:val="Heading2"/>
       </w:pPr>
-      <w:bookmarkStart w:id="5" w:name="_Toc235645532"/>
+      <w:bookmarkStart w:id="5" w:name="_Toc235645925"/>
       <w:r>
         <w:t>Or run from source</w:t>
       </w:r>
       <w:bookmarkEnd w:id="5"/>
     </w:p>
     <w:p>
+      <w:pPr>
+        <w:shd w:val="clear" w:color="auto" w:fill="F1F3F5"/>
+        <w:spacing w:before="60" w:after="0"/>
+        <w:ind w:left="144"/>
+      </w:pPr>
       <w:r>
         <w:rPr>
-          <w:rFonts w:ascii="Consolas" w:hAnsi="Consolas"/>
-          <w:sz w:val="19"/>
+          <w:rFonts w:ascii="Courier New" w:eastAsia="Courier New" w:hAnsi="Courier New"/>
+          <w:color w:val="1E1E1E"/>
+          <w:sz w:val="16"/>
         </w:rPr>
         <w:t>git clone https://github.com/Radware/F5-to-Alteon-Migrator.git</w:t>
       </w:r>
     </w:p>
     <w:p>
+      <w:pPr>
+        <w:shd w:val="clear" w:color="auto" w:fill="F1F3F5"/>
+        <w:spacing w:after="0"/>
+        <w:ind w:left="144"/>
+      </w:pPr>
       <w:r>
         <w:rPr>
-          <w:rFonts w:ascii="Consolas" w:hAnsi="Consolas"/>
-          <w:sz w:val="19"/>
+          <w:rFonts w:ascii="Courier New" w:eastAsia="Courier New" w:hAnsi="Courier New"/>
+          <w:color w:val="1E1E1E"/>
+          <w:sz w:val="16"/>
         </w:rPr>
         <w:t>cd F5-to-Alteon-Migrator/node</w:t>
       </w:r>
     </w:p>
     <w:p>
+      <w:pPr>
+        <w:shd w:val="clear" w:color="auto" w:fill="F1F3F5"/>
+        <w:spacing w:after="140"/>
+        <w:ind w:left="144"/>
+      </w:pPr>
       <w:r>
         <w:rPr>
-          <w:rFonts w:ascii="Consolas" w:hAnsi="Consolas"/>
-          <w:sz w:val="19"/>
+          <w:rFonts w:ascii="Courier New" w:eastAsia="Courier New" w:hAnsi="Courier New"/>
+          <w:color w:val="1E1E1E"/>
+          <w:sz w:val="16"/>
         </w:rPr>
         <w:t>node bin/f5-to-alteon.js device.qkview -o out/</w:t>
       </w:r>
@@ -1761,7 +1862,7 @@
       <w:pPr>
         <w:pStyle w:val="Heading1"/>
       </w:pPr>
-      <w:bookmarkStart w:id="6" w:name="_Toc235645533"/>
+      <w:bookmarkStart w:id="6" w:name="_Toc235645926"/>
       <w:r>
         <w:t>Supported Inputs</w:t>
       </w:r>
@@ -1814,14 +1915,29 @@
     </w:p>
     <w:p>
       <w:r>
-        <w:t>To export from the F5 side: run tmsh save sys config and take /config/bigip.conf and /config/bigip_base.conf - or simply generate a qkview and feed it whole.</w:t>
+        <w:t>To export from the F5 side, save the configuration and take /config/bigip.conf and /config/bigip_base.conf - or simply generate a qkview and feed it whole:</w:t>
       </w:r>
     </w:p>
     <w:p>
       <w:pPr>
+        <w:shd w:val="clear" w:color="auto" w:fill="F1F3F5"/>
+        <w:spacing w:before="60" w:after="140"/>
+        <w:ind w:left="144"/>
+      </w:pPr>
+      <w:r>
+        <w:rPr>
+          <w:rFonts w:ascii="Courier New" w:eastAsia="Courier New" w:hAnsi="Courier New"/>
+          <w:color w:val="1E1E1E"/>
+          <w:sz w:val="16"/>
+        </w:rPr>
+        <w:t>tmsh save sys config</w:t>
+      </w:r>
+    </w:p>
+    <w:p>
+      <w:pPr>
         <w:pStyle w:val="Heading1"/>
       </w:pPr>
-      <w:bookmarkStart w:id="7" w:name="_Toc235645534"/>
+      <w:bookmarkStart w:id="7" w:name="_Toc235645927"/>
       <w:r>
         <w:t>Step-by-Step Migration</w:t>
       </w:r>
@@ -1831,17 +1947,23 @@
       <w:pPr>
         <w:pStyle w:val="Heading2"/>
       </w:pPr>
-      <w:bookmarkStart w:id="8" w:name="_Toc235645535"/>
+      <w:bookmarkStart w:id="8" w:name="_Toc235645928"/>
       <w:r>
         <w:t>Step 1 - Convert</w:t>
       </w:r>
       <w:bookmarkEnd w:id="8"/>
     </w:p>
     <w:p>
+      <w:pPr>
+        <w:shd w:val="clear" w:color="auto" w:fill="F1F3F5"/>
+        <w:spacing w:before="60" w:after="140"/>
+        <w:ind w:left="144"/>
+      </w:pPr>
       <w:r>
         <w:rPr>
-          <w:rFonts w:ascii="Consolas" w:hAnsi="Consolas"/>
-          <w:sz w:val="19"/>
+          <w:rFonts w:ascii="Courier New" w:eastAsia="Courier New" w:hAnsi="Courier New"/>
+          <w:color w:val="1E1E1E"/>
+          <w:sz w:val="16"/>
         </w:rPr>
         <w:t>npx @radware/f5-to-alteon device.qkview -o out/ --name mydevice</w:t>
       </w:r>
@@ -1855,7 +1977,7 @@
       <w:pPr>
         <w:pStyle w:val="Heading2"/>
       </w:pPr>
-      <w:bookmarkStart w:id="9" w:name="_Toc235645536"/>
+      <w:bookmarkStart w:id="9" w:name="_Toc235645929"/>
       <w:r>
         <w:t>Step 2 - Review the logs</w:t>
       </w:r>
@@ -1870,7 +1992,7 @@
       <w:pPr>
         <w:pStyle w:val="Heading2"/>
       </w:pPr>
-      <w:bookmarkStart w:id="10" w:name="_Toc235645537"/>
+      <w:bookmarkStart w:id="10" w:name="_Toc235645930"/>
       <w:r>
         <w:t>Step 3 - Apply on the Alteon</w:t>
       </w:r>
@@ -1878,14 +2000,34 @@
     </w:p>
     <w:p>
       <w:r>
-        <w:t>Paste the output into an Alteon CLI session (or stream it over SSH), then run apply. The output is ordered so objects are defined before they are referenced. Review with the /info and /cfg menus, and only then save to FLASH.</w:t>
+        <w:t>Paste the output into an Alteon CLI session (or stream it over SSH), then activate it:</w:t>
       </w:r>
     </w:p>
     <w:p>
       <w:pPr>
+        <w:shd w:val="clear" w:color="auto" w:fill="F1F3F5"/>
+        <w:spacing w:before="60" w:after="140"/>
+        <w:ind w:left="144"/>
+      </w:pPr>
+      <w:r>
+        <w:rPr>
+          <w:rFonts w:ascii="Courier New" w:eastAsia="Courier New" w:hAnsi="Courier New"/>
+          <w:color w:val="1E1E1E"/>
+          <w:sz w:val="16"/>
+        </w:rPr>
+        <w:t>apply</w:t>
+      </w:r>
+    </w:p>
+    <w:p>
+      <w:r>
+        <w:t>The output is ordered so objects are defined before they are referenced. Review with the /info and /cfg menus, and only then save to FLASH.</w:t>
+      </w:r>
+    </w:p>
+    <w:p>
+      <w:pPr>
         <w:pStyle w:val="Heading2"/>
       </w:pPr>
-      <w:bookmarkStart w:id="11" w:name="_Toc235645538"/>
+      <w:bookmarkStart w:id="11" w:name="_Toc235645931"/>
       <w:r>
         <w:t>Step 4 - Verify traffic</w:t>
       </w:r>
@@ -1900,7 +2042,7 @@
       <w:pPr>
         <w:pStyle w:val="Heading1"/>
       </w:pPr>
-      <w:bookmarkStart w:id="12" w:name="_Toc235645539"/>
+      <w:bookmarkStart w:id="12" w:name="_Toc235645932"/>
       <w:r>
         <w:t>Command Reference</w:t>
       </w:r>
@@ -1934,7 +2076,7 @@
       <w:pPr>
         <w:pStyle w:val="Heading1"/>
       </w:pPr>
-      <w:bookmarkStart w:id="13" w:name="_Toc235645540"/>
+      <w:bookmarkStart w:id="13" w:name="_Toc235645933"/>
       <w:r>
         <w:t>Route Domains</w:t>
       </w:r>
@@ -1973,7 +2115,7 @@
       <w:pPr>
         <w:pStyle w:val="Heading1"/>
       </w:pPr>
-      <w:bookmarkStart w:id="14" w:name="_Toc235645541"/>
+      <w:bookmarkStart w:id="14" w:name="_Toc235645934"/>
       <w:r>
         <w:t>What Is Converted</w:t>
       </w:r>
@@ -1993,7 +2135,7 @@
       <w:pPr>
         <w:pStyle w:val="Heading1"/>
       </w:pPr>
-      <w:bookmarkStart w:id="15" w:name="_Toc235645542"/>
+      <w:bookmarkStart w:id="15" w:name="_Toc235645935"/>
       <w:r>
         <w:t>Validation Summary</w:t>
       </w:r>
@@ -2035,7 +2177,7 @@
       <w:pPr>
         <w:pStyle w:val="Heading1"/>
       </w:pPr>
-      <w:bookmarkStart w:id="16" w:name="_Toc235645543"/>
+      <w:bookmarkStart w:id="16" w:name="_Toc235645936"/>
       <w:r>
         <w:t>Troubleshooting</w:t>
       </w:r>
@@ -2077,7 +2219,7 @@
       <w:pPr>
         <w:pStyle w:val="Heading1"/>
       </w:pPr>
-      <w:bookmarkStart w:id="17" w:name="_Toc235645544"/>
+      <w:bookmarkStart w:id="17" w:name="_Toc235645937"/>
       <w:r>
         <w:t>References</w:t>
       </w:r>
@@ -13322,13 +13464,6 @@
     <w:notTrueType/>
     <w:pitch w:val="default"/>
   </w:font>
-  <w:font w:name="Consolas">
-    <w:panose1 w:val="020B0609020204030204"/>
-    <w:charset w:val="00"/>
-    <w:family w:val="modern"/>
-    <w:pitch w:val="fixed"/>
-    <w:sig w:usb0="E00006FF" w:usb1="0000FCFF" w:usb2="00000001" w:usb3="00000000" w:csb0="0000019F" w:csb1="00000000"/>
-  </w:font>
   <w:font w:name="Titillium Web Bold">
     <w:altName w:val="Cambria"/>
     <w:panose1 w:val="00000000000000000000"/>
@@ -13384,7 +13519,6 @@
     <w:rsidRoot w:val="00B97F03"/>
     <w:rsid w:val="00003550"/>
     <w:rsid w:val="00005423"/>
-    <w:rsid w:val="00022D64"/>
     <w:rsid w:val="00037C2D"/>
     <w:rsid w:val="000B38D6"/>
     <w:rsid w:val="00193D13"/>
@@ -13406,13 +13540,14 @@
     <w:rsid w:val="00662E95"/>
     <w:rsid w:val="006916D8"/>
     <w:rsid w:val="007019D4"/>
-    <w:rsid w:val="007742C1"/>
     <w:rsid w:val="007C1D52"/>
     <w:rsid w:val="007C5C30"/>
     <w:rsid w:val="007F38A7"/>
     <w:rsid w:val="00817BDC"/>
     <w:rsid w:val="008700DD"/>
+    <w:rsid w:val="008721F2"/>
     <w:rsid w:val="008A11DB"/>
+    <w:rsid w:val="00907C5E"/>
     <w:rsid w:val="00956942"/>
     <w:rsid w:val="00994F4D"/>
     <w:rsid w:val="009D334B"/>

</xml_diff>